<commit_message>
Tell the guide what to do when a measure name already exists
Power BI offers to rename a duplicate measure for you, and accepting that is
the wrong move here: the measures reference each other, so a measure silently
renamed to "Total Profit 2" leaves Margin % calling something that no longer
exists.

The message nearly always means the measures are already in the model —
usually because the generated .pbip was opened, which already contains all
twenty-two, and Part 4 was then followed as well. The guide now says to count
them instead of adding them: fifteen on Sales, seven on CustomerSegments.

Checked all twenty-three measure names against every column of every table
while writing this: none collides on its own table. Revenue and Customers do
match columns on other tables, which Power BI permits.

Co-Authored-By: Claude Opus 5 <noreply@anthropic.com>
Claude-Session: https://claude.ai/code/session_01VZUVZ4Kh74tBbebjZDm9fE
</commit_message>
<xml_diff>
--- a/docs/PowerBI_Build_Guide.docx
+++ b/docs/PowerBI_Build_Guide.docx
@@ -4190,6 +4190,171 @@
         <w:t>DIVIDE ( [Segment Profit],</w:t>
         <w:br/>
         <w:t xml:space="preserve">         CALCULATE ( [Segment Profit], ALL ( CustomerSegments ) ) ) * 100</w:t>
+      </w:r>
+    </w:p>
+    <w:p>
+      <w:pPr>
+        <w:pStyle w:val="Heading2"/>
+      </w:pPr>
+      <w:r>
+        <w:t>If Power BI says the name already exists</w:t>
+      </w:r>
+    </w:p>
+    <w:p>
+      <w:r>
+        <w:t xml:space="preserve">It offers to pick a different name for you. </w:t>
+      </w:r>
+      <w:r>
+        <w:rPr>
+          <w:b/>
+        </w:rPr>
+        <w:t>Do not accept that.</w:t>
+      </w:r>
+      <w:r>
+        <w:t xml:space="preserve"> The measures reference each other — </w:t>
+      </w:r>
+      <w:r>
+        <w:rPr>
+          <w:rFonts w:ascii="Consolas" w:hAnsi="Consolas"/>
+          <w:color w:val="2F6F9F"/>
+          <w:sz w:val="18"/>
+        </w:rPr>
+        <w:t>Margin %</w:t>
+      </w:r>
+      <w:r>
+        <w:t xml:space="preserve"> uses </w:t>
+      </w:r>
+      <w:r>
+        <w:rPr>
+          <w:rFonts w:ascii="Consolas" w:hAnsi="Consolas"/>
+          <w:color w:val="2F6F9F"/>
+          <w:sz w:val="18"/>
+        </w:rPr>
+        <w:t>[Total Profit]</w:t>
+      </w:r>
+      <w:r>
+        <w:t xml:space="preserve">, </w:t>
+      </w:r>
+      <w:r>
+        <w:rPr>
+          <w:rFonts w:ascii="Consolas" w:hAnsi="Consolas"/>
+          <w:color w:val="2F6F9F"/>
+          <w:sz w:val="18"/>
+        </w:rPr>
+        <w:t>Gap to Peak %</w:t>
+      </w:r>
+      <w:r>
+        <w:t xml:space="preserve"> uses </w:t>
+      </w:r>
+      <w:r>
+        <w:rPr>
+          <w:rFonts w:ascii="Consolas" w:hAnsi="Consolas"/>
+          <w:color w:val="2F6F9F"/>
+          <w:sz w:val="18"/>
+        </w:rPr>
+        <w:t>[Revenue per Month]</w:t>
+      </w:r>
+      <w:r>
+        <w:t xml:space="preserve"> — so a measure silently renamed to </w:t>
+      </w:r>
+      <w:r>
+        <w:rPr>
+          <w:rFonts w:ascii="Consolas" w:hAnsi="Consolas"/>
+          <w:color w:val="2F6F9F"/>
+          <w:sz w:val="18"/>
+        </w:rPr>
+        <w:t>Total Profit 2</w:t>
+      </w:r>
+      <w:r>
+        <w:t xml:space="preserve"> leaves the ones that call it broken or pointing at nothing.</w:t>
+      </w:r>
+    </w:p>
+    <w:p>
+      <w:r>
+        <w:t>The message means the measure is already in the model. Three ways that happens:</w:t>
+      </w:r>
+    </w:p>
+    <w:p>
+      <w:r>
+        <w:rPr>
+          <w:b/>
+        </w:rPr>
+        <w:t>You opened the generated `.pbip`.</w:t>
+      </w:r>
+      <w:r>
+        <w:t xml:space="preserve"> It already contains all 22 measures, so this whole Part is done — skip to Part 5 and verify them instead. Check the Data pane: measures carry a small calculator icon, columns do not.</w:t>
+      </w:r>
+    </w:p>
+    <w:p>
+      <w:r>
+        <w:rPr>
+          <w:b/>
+        </w:rPr>
+        <w:t>The Tabular Editor script ran twice.</w:t>
+      </w:r>
+      <w:r>
+        <w:t xml:space="preserve"> Same outcome. Check the Data pane before running it again.</w:t>
+      </w:r>
+    </w:p>
+    <w:p>
+      <w:r>
+        <w:rPr>
+          <w:b/>
+        </w:rPr>
+        <w:t>Someone else in the group already added them</w:t>
+      </w:r>
+      <w:r>
+        <w:t xml:space="preserve"> to the file you are sharing.</w:t>
+      </w:r>
+    </w:p>
+    <w:p>
+      <w:r>
+        <w:t xml:space="preserve">Either way the fix is to stop adding and check what is there. Click the </w:t>
+      </w:r>
+      <w:r>
+        <w:rPr>
+          <w:rFonts w:ascii="Consolas" w:hAnsi="Consolas"/>
+          <w:color w:val="2F6F9F"/>
+          <w:sz w:val="18"/>
+        </w:rPr>
+        <w:t>Sales</w:t>
+      </w:r>
+      <w:r>
+        <w:t xml:space="preserve"> table in the Data pane and count: there should be </w:t>
+      </w:r>
+      <w:r>
+        <w:rPr>
+          <w:b/>
+        </w:rPr>
+        <w:t>fifteen</w:t>
+      </w:r>
+      <w:r>
+        <w:t xml:space="preserve"> measures on it and </w:t>
+      </w:r>
+      <w:r>
+        <w:rPr>
+          <w:b/>
+        </w:rPr>
+        <w:t>seven</w:t>
+      </w:r>
+      <w:r>
+        <w:t xml:space="preserve"> on </w:t>
+      </w:r>
+      <w:r>
+        <w:rPr>
+          <w:rFonts w:ascii="Consolas" w:hAnsi="Consolas"/>
+          <w:color w:val="2F6F9F"/>
+          <w:sz w:val="18"/>
+        </w:rPr>
+        <w:t>CustomerSegments</w:t>
+      </w:r>
+      <w:r>
+        <w:t>. If the count is right, Part 4 is finished.</w:t>
+      </w:r>
+    </w:p>
+    <w:p>
+      <w:r>
+        <w:t>If you genuinely need to start over, delete the measures first — right-click → Delete from model — rather than creating renamed duplicates alongside them.</w:t>
       </w:r>
     </w:p>
     <w:p>

</xml_diff>